<commit_message>
Update project regulation version document
</commit_message>
<xml_diff>
--- a/docs/PR6_Project_Regulation.docx
+++ b/docs/PR6_Project_Regulation.docx
@@ -855,15 +855,7 @@
           <w:sz w:val="24"/>
           <w:szCs w:val="24"/>
         </w:rPr>
-        <w:t xml:space="preserve"> –</w:t>
-      </w:r>
-      <w:r>
-        <w:rPr>
-          <w:color w:val="000000"/>
-          <w:sz w:val="24"/>
-          <w:szCs w:val="24"/>
-        </w:rPr>
-        <w:t xml:space="preserve"> </w:t>
+        <w:t xml:space="preserve"> – </w:t>
       </w:r>
       <w:r>
         <w:rPr>
@@ -920,15 +912,7 @@
           <w:sz w:val="24"/>
           <w:szCs w:val="24"/>
         </w:rPr>
-        <w:t xml:space="preserve"> –</w:t>
-      </w:r>
-      <w:r>
-        <w:rPr>
-          <w:color w:val="000000"/>
-          <w:sz w:val="24"/>
-          <w:szCs w:val="24"/>
-        </w:rPr>
-        <w:t xml:space="preserve"> </w:t>
+        <w:t xml:space="preserve"> – </w:t>
       </w:r>
       <w:r>
         <w:rPr>
@@ -1021,15 +1005,7 @@
           <w:sz w:val="24"/>
           <w:szCs w:val="24"/>
         </w:rPr>
-        <w:t xml:space="preserve"> </w:t>
-      </w:r>
-      <w:r>
-        <w:rPr>
-          <w:color w:val="000000"/>
-          <w:sz w:val="24"/>
-          <w:szCs w:val="24"/>
-        </w:rPr>
-        <w:t>–</w:t>
+        <w:t xml:space="preserve"> –</w:t>
       </w:r>
       <w:r>
         <w:rPr>
@@ -1094,15 +1070,7 @@
           <w:sz w:val="24"/>
           <w:szCs w:val="24"/>
         </w:rPr>
-        <w:t xml:space="preserve"> –</w:t>
-      </w:r>
-      <w:r>
-        <w:rPr>
-          <w:color w:val="000000"/>
-          <w:sz w:val="24"/>
-          <w:szCs w:val="24"/>
-        </w:rPr>
-        <w:t xml:space="preserve"> </w:t>
+        <w:t xml:space="preserve"> – </w:t>
       </w:r>
       <w:r>
         <w:rPr>
@@ -1159,15 +1127,7 @@
           <w:sz w:val="24"/>
           <w:szCs w:val="24"/>
         </w:rPr>
-        <w:t xml:space="preserve"> –</w:t>
-      </w:r>
-      <w:r>
-        <w:rPr>
-          <w:color w:val="000000"/>
-          <w:sz w:val="24"/>
-          <w:szCs w:val="24"/>
-        </w:rPr>
-        <w:t xml:space="preserve"> </w:t>
+        <w:t xml:space="preserve"> – </w:t>
       </w:r>
       <w:r>
         <w:rPr>
@@ -1240,15 +1200,7 @@
           <w:sz w:val="24"/>
           <w:szCs w:val="24"/>
         </w:rPr>
-        <w:t xml:space="preserve"> –</w:t>
-      </w:r>
-      <w:r>
-        <w:rPr>
-          <w:color w:val="000000"/>
-          <w:sz w:val="24"/>
-          <w:szCs w:val="24"/>
-        </w:rPr>
-        <w:t xml:space="preserve"> </w:t>
+        <w:t xml:space="preserve"> – </w:t>
       </w:r>
       <w:r>
         <w:rPr>
@@ -1313,15 +1265,7 @@
           <w:sz w:val="24"/>
           <w:szCs w:val="24"/>
         </w:rPr>
-        <w:t xml:space="preserve"> –</w:t>
-      </w:r>
-      <w:r>
-        <w:rPr>
-          <w:color w:val="000000"/>
-          <w:sz w:val="24"/>
-          <w:szCs w:val="24"/>
-        </w:rPr>
-        <w:t xml:space="preserve"> </w:t>
+        <w:t xml:space="preserve"> – </w:t>
       </w:r>
       <w:r>
         <w:rPr>
@@ -2124,23 +2068,7 @@
           <w:sz w:val="24"/>
           <w:szCs w:val="24"/>
         </w:rPr>
-        <w:t>ормат</w:t>
-      </w:r>
-      <w:r>
-        <w:rPr>
-          <w:color w:val="000000"/>
-          <w:sz w:val="24"/>
-          <w:szCs w:val="24"/>
-        </w:rPr>
-        <w:t xml:space="preserve"> </w:t>
-      </w:r>
-      <w:r>
-        <w:rPr>
-          <w:color w:val="000000"/>
-          <w:sz w:val="24"/>
-          <w:szCs w:val="24"/>
-        </w:rPr>
-        <w:t xml:space="preserve">запису </w:t>
+        <w:t xml:space="preserve">ормат запису </w:t>
       </w:r>
       <w:r>
         <w:rPr>
@@ -2526,16 +2454,7 @@
           <w:sz w:val="24"/>
           <w:szCs w:val="24"/>
         </w:rPr>
-        <w:t>П</w:t>
-      </w:r>
-      <w:r>
-        <w:rPr>
-          <w:color w:val="000000"/>
-          <w:spacing w:val="-8"/>
-          <w:sz w:val="24"/>
-          <w:szCs w:val="24"/>
-        </w:rPr>
-        <w:t>отрібна, щоб користувачі знали, яку саме редакцію продукту чи коду вони використовують.</w:t>
+        <w:t>Потрібна, щоб користувачі знали, яку саме редакцію продукту чи коду вони використовують.</w:t>
       </w:r>
     </w:p>
     <w:p>
@@ -3366,7 +3285,7 @@
           <w:sz w:val="24"/>
           <w:szCs w:val="24"/>
         </w:rPr>
-        <w:t>Initial</w:t>
+        <w:t>Update</w:t>
       </w:r>
       <w:proofErr w:type="spellEnd"/>
       <w:r>
@@ -3402,61 +3321,7 @@
           <w:sz w:val="24"/>
           <w:szCs w:val="24"/>
         </w:rPr>
-        <w:t>structure</w:t>
-      </w:r>
-      <w:proofErr w:type="spellEnd"/>
-      <w:r>
-        <w:rPr>
-          <w:color w:val="000000"/>
-          <w:sz w:val="24"/>
-          <w:szCs w:val="24"/>
-        </w:rPr>
-        <w:t xml:space="preserve"> </w:t>
-      </w:r>
-      <w:proofErr w:type="spellStart"/>
-      <w:r>
-        <w:rPr>
-          <w:color w:val="000000"/>
-          <w:sz w:val="24"/>
-          <w:szCs w:val="24"/>
-        </w:rPr>
-        <w:t>and</w:t>
-      </w:r>
-      <w:proofErr w:type="spellEnd"/>
-      <w:r>
-        <w:rPr>
-          <w:color w:val="000000"/>
-          <w:sz w:val="24"/>
-          <w:szCs w:val="24"/>
-        </w:rPr>
-        <w:t xml:space="preserve"> </w:t>
-      </w:r>
-      <w:proofErr w:type="spellStart"/>
-      <w:r>
-        <w:rPr>
-          <w:color w:val="000000"/>
-          <w:sz w:val="24"/>
-          <w:szCs w:val="24"/>
-        </w:rPr>
-        <w:t>docs</w:t>
-      </w:r>
-      <w:proofErr w:type="spellEnd"/>
-      <w:r>
-        <w:rPr>
-          <w:color w:val="000000"/>
-          <w:sz w:val="24"/>
-          <w:szCs w:val="24"/>
-        </w:rPr>
-        <w:t xml:space="preserve"> </w:t>
-      </w:r>
-      <w:proofErr w:type="spellStart"/>
-      <w:r>
-        <w:rPr>
-          <w:color w:val="000000"/>
-          <w:sz w:val="24"/>
-          <w:szCs w:val="24"/>
-        </w:rPr>
-        <w:t>templates</w:t>
+        <w:t>documentation</w:t>
       </w:r>
       <w:proofErr w:type="spellEnd"/>
     </w:p>
@@ -10018,13 +9883,13 @@
 </file>
 
 <file path=customXml/item2.xml><?xml version="1.0" encoding="utf-8"?>
+<b:Sources xmlns:b="http://schemas.openxmlformats.org/officeDocument/2006/bibliography" xmlns="http://schemas.openxmlformats.org/officeDocument/2006/bibliography" SelectedStyle="\APASixthEditionOfficeOnline.xsl" StyleName="APA" Version="6"/>
+</file>
+
+<file path=customXml/item3.xml><?xml version="1.0" encoding="utf-8"?>
 <go:gDocsCustomXmlDataStorage xmlns:go="http://customooxmlschemas.google.com/" xmlns:r="http://schemas.openxmlformats.org/officeDocument/2006/relationships" uri="GoogleDocsCustomDataVersion2">
   <go:docsCustomData xmlns:go="http://customooxmlschemas.google.com/" roundtripDataSignature="AMtx7miRy1cid9oqHdduhR8wP0GjI6w7cg==">CgMxLjAyDmgubTk0bDJmNzFhajM5Mg5oLmVnMG05ZjUxMWszczIOaC5ibDAzMDhya2I2Z2QyDmgudnU3ZTdkcWtsem4zOAByITFraFpOR05RMzBOY1NaT2wyZTNacEFpWUxuamVkcC14cA==</go:docsCustomData>
 </go:gDocsCustomXmlDataStorage>
-</file>
-
-<file path=customXml/item3.xml><?xml version="1.0" encoding="utf-8"?>
-<b:Sources xmlns:b="http://schemas.openxmlformats.org/officeDocument/2006/bibliography" xmlns="http://schemas.openxmlformats.org/officeDocument/2006/bibliography" SelectedStyle="\APASixthEditionOfficeOnline.xsl" StyleName="APA" Version="6"/>
 </file>
 
 <file path=customXml/itemProps1.xml><?xml version="1.0" encoding="utf-8"?>
@@ -10036,18 +9901,18 @@
 </file>
 
 <file path=customXml/itemProps2.xml><?xml version="1.0" encoding="utf-8"?>
+<ds:datastoreItem xmlns:ds="http://schemas.openxmlformats.org/officeDocument/2006/customXml" ds:itemID="{BC699F6E-CD0B-4C66-93A9-D23A8D4AC8CC}">
+  <ds:schemaRefs>
+    <ds:schemaRef ds:uri="http://schemas.openxmlformats.org/officeDocument/2006/bibliography"/>
+  </ds:schemaRefs>
+</ds:datastoreItem>
+</file>
+
+<file path=customXml/itemProps3.xml><?xml version="1.0" encoding="utf-8"?>
 <ds:datastoreItem xmlns:ds="http://schemas.openxmlformats.org/officeDocument/2006/customXml" ds:itemID="{11111111-1234-1234-1234-123412341234}">
   <ds:schemaRefs>
     <ds:schemaRef ds:uri="http://customooxmlschemas.google.com/"/>
     <ds:schemaRef ds:uri="http://schemas.openxmlformats.org/officeDocument/2006/relationships"/>
   </ds:schemaRefs>
 </ds:datastoreItem>
-</file>
-
-<file path=customXml/itemProps3.xml><?xml version="1.0" encoding="utf-8"?>
-<ds:datastoreItem xmlns:ds="http://schemas.openxmlformats.org/officeDocument/2006/customXml" ds:itemID="{BC699F6E-CD0B-4C66-93A9-D23A8D4AC8CC}">
-  <ds:schemaRefs>
-    <ds:schemaRef ds:uri="http://schemas.openxmlformats.org/officeDocument/2006/bibliography"/>
-  </ds:schemaRefs>
-</ds:datastoreItem>
 </file>
</xml_diff>